<commit_message>
T5.6: Fix TOC/TOF/TOT renderers — wrap fldChar/instrText in w:r runs; add post-build OOXML structural validator to QA hook
</commit_message>
<xml_diff>
--- a/Final_Manuals/Final_Client_Manual.docx
+++ b/Final_Manuals/Final_Client_Manual.docx
@@ -1480,9 +1480,9 @@
           <w:color w:val="1B365D"/>
           <w:sz w:val="40"/>
         </w:rPr>
-        <w:t>10.</w:t>
+        <w:t>2.</w:t>
         <w:tab/>
-        <w:t>login</w:t>
+        <w:t>dashboard</w:t>
       </w:r>
     </w:p>
     <w:p>
@@ -1495,7 +1495,7 @@
           <w:color w:val="333333"/>
           <w:sz w:val="21"/>
         </w:rPr>
-        <w:t>The Login module serves as the gateway to the Enterprise Application, ensuring secure access for all users. Within this module, the Google Search screen allows users to quickly perform web searches and reach related tools without leaving the application.</w:t>
+        <w:t>The Dashboard module gives users a centralized view of system activity and performance. From here you can quickly assess active records, cooperative information, and essential metrics to support informed decision‑making.</w:t>
       </w:r>
     </w:p>
     <w:p>
@@ -1509,7 +1509,7 @@
           <w:color w:val="D97706"/>
           <w:sz w:val="21"/>
         </w:rPr>
-        <w:t>The login module includes features for:</w:t>
+        <w:t>The dashboard module includes features for:</w:t>
       </w:r>
     </w:p>
     <w:p>
@@ -1523,7 +1523,21 @@
           <w:color w:val="333333"/>
           <w:sz w:val="21"/>
         </w:rPr>
-        <w:t>Google Search — perform web searches and access related tools</w:t>
+        <w:t>Dashboard — view a summary of all active records and key system metrics.</w:t>
+      </w:r>
+    </w:p>
+    <w:p>
+      <w:pPr>
+        <w:pStyle w:val="ListBullet"/>
+        <w:spacing w:after="40"/>
+      </w:pPr>
+      <w:r>
+        <w:rPr>
+          <w:rFonts w:ascii="Arial" w:hAnsi="Arial"/>
+          <w:color w:val="333333"/>
+          <w:sz w:val="21"/>
+        </w:rPr>
+        <w:t>Cooperatives at a glance — review cooperative societies, federations, banks and related reports.</w:t>
       </w:r>
     </w:p>
     <w:p>
@@ -1544,9 +1558,9 @@
           <w:color w:val="D97706"/>
           <w:sz w:val="32"/>
         </w:rPr>
-        <w:t>10.1</w:t>
+        <w:t>2.1</w:t>
         <w:tab/>
-        <w:t>Google Search</w:t>
+        <w:t>Dashboard</w:t>
       </w:r>
     </w:p>
     <w:p>
@@ -1559,7 +1573,7 @@
           <w:color w:val="333333"/>
           <w:sz w:val="21"/>
         </w:rPr>
-        <w:t>The Google Search screen enables users to perform web searches and access related tools.</w:t>
+        <w:t>The Dashboard screen provides an overview of all active records and key system metrics.</w:t>
       </w:r>
     </w:p>
     <w:p>
@@ -1572,7 +1586,7 @@
           <w:color w:val="333333"/>
           <w:sz w:val="21"/>
         </w:rPr>
-        <w:t>Navigate to Google Search from the main menu.</w:t>
+        <w:t>Navigate to Dashboard from the main menu.</w:t>
       </w:r>
     </w:p>
     <w:p>
@@ -1637,7 +1651,7 @@
           <w:color w:val="D97706"/>
           <w:sz w:val="20"/>
         </w:rPr>
-        <w:t>10-</w:t>
+        <w:t>2-</w:t>
       </w:r>
       <w:r>
         <w:rPr>
@@ -1686,7 +1700,7 @@
           <w:color w:val="828282"/>
           <w:sz w:val="20"/>
         </w:rPr>
-        <w:t xml:space="preserve"> Google Search</w:t>
+        <w:t xml:space="preserve"> Dashboard</w:t>
       </w:r>
     </w:p>
     <w:p>
@@ -1714,7 +1728,7 @@
           <w:color w:val="333333"/>
           <w:sz w:val="21"/>
         </w:rPr>
-        <w:t>Click on the Search field to activate it.</w:t>
+        <w:t>Click on Cooperatives at a glance.</w:t>
       </w:r>
     </w:p>
     <w:p>
@@ -1728,35 +1742,7 @@
           <w:color w:val="333333"/>
           <w:sz w:val="21"/>
         </w:rPr>
-        <w:t>Enter the search terms in the Search field.</w:t>
-      </w:r>
-    </w:p>
-    <w:p>
-      <w:pPr>
-        <w:pStyle w:val="ListBullet"/>
-        <w:spacing w:after="40"/>
-      </w:pPr>
-      <w:r>
-        <w:rPr>
-          <w:rFonts w:ascii="Arial" w:hAnsi="Arial"/>
-          <w:color w:val="333333"/>
-          <w:sz w:val="21"/>
-        </w:rPr>
-        <w:t>Click on the Google Search button to submit the query.</w:t>
-      </w:r>
-    </w:p>
-    <w:p>
-      <w:pPr>
-        <w:pStyle w:val="ListBullet"/>
-        <w:spacing w:after="40"/>
-      </w:pPr>
-      <w:r>
-        <w:rPr>
-          <w:rFonts w:ascii="Arial" w:hAnsi="Arial"/>
-          <w:color w:val="333333"/>
-          <w:sz w:val="21"/>
-        </w:rPr>
-        <w:t>Click on the I'm Feeling Lucky button to open the top result directly.</w:t>
+        <w:t>The Cooperatives at a glance page will be displayed.</w:t>
       </w:r>
     </w:p>
     <w:p>
@@ -1778,7 +1764,1113 @@
           <w:color w:val="333333"/>
           <w:sz w:val="21"/>
         </w:rPr>
-        <w:t>Voice and image search require appropriate device permissions.</w:t>
+        <w:t>User information is displayed at the top right corner of the screen.</w:t>
+      </w:r>
+    </w:p>
+    <w:p>
+      <w:r>
+        <w:br w:type="page"/>
+      </w:r>
+    </w:p>
+    <w:p>
+      <w:pPr>
+        <w:pStyle w:val="Heading2"/>
+        <w:keepNext/>
+        <w:spacing w:before="360" w:after="160"/>
+      </w:pPr>
+      <w:r>
+        <w:rPr>
+          <w:rFonts w:ascii="Segoe UI" w:hAnsi="Segoe UI"/>
+          <w:b/>
+          <w:color w:val="D97706"/>
+          <w:sz w:val="32"/>
+        </w:rPr>
+        <w:t>2.2</w:t>
+        <w:tab/>
+        <w:t>Cooperatives at a glance</w:t>
+      </w:r>
+    </w:p>
+    <w:p>
+      <w:pPr>
+        <w:spacing w:line="276" w:lineRule="auto" w:after="120"/>
+      </w:pPr>
+      <w:r>
+        <w:rPr>
+          <w:rFonts w:ascii="Arial" w:hAnsi="Arial"/>
+          <w:color w:val="333333"/>
+          <w:sz w:val="21"/>
+        </w:rPr>
+        <w:t>The Cooperatives at a glance screen provides an overview of cooperative societies, federations, banks and related reports.</w:t>
+      </w:r>
+    </w:p>
+    <w:p>
+      <w:pPr>
+        <w:spacing w:before="40" w:after="120"/>
+      </w:pPr>
+      <w:r>
+        <w:rPr>
+          <w:rFonts w:ascii="Arial" w:hAnsi="Arial"/>
+          <w:b/>
+          <w:color w:val="D97706"/>
+          <w:sz w:val="19"/>
+        </w:rPr>
+        <w:t xml:space="preserve">Path: </w:t>
+      </w:r>
+      <w:r>
+        <w:rPr>
+          <w:rFonts w:ascii="Arial" w:hAnsi="Arial"/>
+          <w:color w:val="333333"/>
+          <w:sz w:val="19"/>
+        </w:rPr>
+        <w:t>Cooperatives at a glance</w:t>
+      </w:r>
+    </w:p>
+    <w:p>
+      <w:pPr>
+        <w:spacing w:line="276" w:lineRule="auto" w:after="120"/>
+      </w:pPr>
+      <w:r>
+        <w:rPr>
+          <w:rFonts w:ascii="Arial" w:hAnsi="Arial"/>
+          <w:color w:val="333333"/>
+          <w:sz w:val="21"/>
+        </w:rPr>
+        <w:t>Navigate to Cooperatives at a glance from the main menu.</w:t>
+      </w:r>
+    </w:p>
+    <w:p>
+      <w:pPr>
+        <w:spacing w:before="80" w:after="80"/>
+        <w:jc w:val="center"/>
+      </w:pPr>
+      <w:r>
+        <w:drawing>
+          <wp:inline xmlns:a="http://schemas.openxmlformats.org/drawingml/2006/main" xmlns:pic="http://schemas.openxmlformats.org/drawingml/2006/picture">
+            <wp:extent cx="5759999" cy="2835000"/>
+            <wp:docPr id="3" name="Picture 3"/>
+            <wp:cNvGraphicFramePr>
+              <a:graphicFrameLocks noChangeAspect="1"/>
+            </wp:cNvGraphicFramePr>
+            <a:graphic>
+              <a:graphicData uri="http://schemas.openxmlformats.org/drawingml/2006/picture">
+                <pic:pic>
+                  <pic:nvPicPr>
+                    <pic:cNvPr id="0" name="screen_2_annotated.png"/>
+                    <pic:cNvPicPr/>
+                  </pic:nvPicPr>
+                  <pic:blipFill>
+                    <a:blip r:embed="rId13"/>
+                    <a:stretch>
+                      <a:fillRect/>
+                    </a:stretch>
+                  </pic:blipFill>
+                  <pic:spPr>
+                    <a:xfrm>
+                      <a:off x="0" y="0"/>
+                      <a:ext cx="5759999" cy="2835000"/>
+                    </a:xfrm>
+                    <a:prstGeom prst="rect"/>
+                  </pic:spPr>
+                </pic:pic>
+              </a:graphicData>
+            </a:graphic>
+          </wp:inline>
+        </w:drawing>
+      </w:r>
+    </w:p>
+    <w:p>
+      <w:pPr>
+        <w:pStyle w:val="Caption"/>
+        <w:spacing w:before="80" w:after="280"/>
+        <w:jc w:val="center"/>
+      </w:pPr>
+      <w:r>
+        <w:rPr>
+          <w:b/>
+          <w:i w:val="0"/>
+          <w:color w:val="D97706"/>
+          <w:sz w:val="20"/>
+        </w:rPr>
+        <w:t xml:space="preserve">Figure </w:t>
+      </w:r>
+      <w:r>
+        <w:rPr>
+          <w:b/>
+          <w:i w:val="0"/>
+          <w:color w:val="D97706"/>
+          <w:sz w:val="20"/>
+        </w:rPr>
+        <w:t>2-</w:t>
+      </w:r>
+      <w:r>
+        <w:rPr>
+          <w:sz w:val="20"/>
+          <w:szCs w:val="20"/>
+          <w:color w:val="D97706"/>
+        </w:rPr>
+        <w:fldChar w:fldCharType="begin"/>
+      </w:r>
+      <w:r>
+        <w:rPr>
+          <w:sz w:val="20"/>
+          <w:szCs w:val="20"/>
+          <w:color w:val="D97706"/>
+        </w:rPr>
+        <w:instrText xml:space="preserve"> SEQ Figure \* ARABIC</w:instrText>
+      </w:r>
+      <w:r>
+        <w:rPr>
+          <w:sz w:val="20"/>
+          <w:szCs w:val="20"/>
+          <w:color w:val="D97706"/>
+        </w:rPr>
+        <w:fldChar w:fldCharType="separate"/>
+      </w:r>
+      <w:r>
+        <w:rPr>
+          <w:sz w:val="20"/>
+          <w:szCs w:val="20"/>
+          <w:color w:val="D97706"/>
+        </w:rPr>
+        <w:t>1</w:t>
+      </w:r>
+      <w:r>
+        <w:rPr>
+          <w:sz w:val="20"/>
+          <w:szCs w:val="20"/>
+          <w:color w:val="D97706"/>
+        </w:rPr>
+        <w:fldChar w:fldCharType="end"/>
+      </w:r>
+      <w:r>
+        <w:rPr>
+          <w:b w:val="0"/>
+          <w:i/>
+          <w:color w:val="828282"/>
+          <w:sz w:val="20"/>
+        </w:rPr>
+        <w:t xml:space="preserve"> Cooperatives at a glance</w:t>
+      </w:r>
+    </w:p>
+    <w:p>
+      <w:pPr>
+        <w:spacing w:before="120" w:after="80"/>
+      </w:pPr>
+      <w:r>
+        <w:rPr>
+          <w:rFonts w:ascii="Arial" w:hAnsi="Arial"/>
+          <w:b/>
+          <w:color w:val="D97706"/>
+          <w:sz w:val="21"/>
+        </w:rPr>
+        <w:t>User Actions / Steps:</w:t>
+      </w:r>
+    </w:p>
+    <w:p>
+      <w:pPr>
+        <w:pStyle w:val="ListBullet"/>
+        <w:spacing w:after="40"/>
+      </w:pPr>
+      <w:r>
+        <w:rPr>
+          <w:rFonts w:ascii="Arial" w:hAnsi="Arial"/>
+          <w:color w:val="333333"/>
+          <w:sz w:val="21"/>
+        </w:rPr>
+        <w:t>Click the Cooperative Societies ▶ button to view cooperative societies.</w:t>
+      </w:r>
+    </w:p>
+    <w:p>
+      <w:pPr>
+        <w:pStyle w:val="ListBullet"/>
+        <w:spacing w:after="40"/>
+      </w:pPr>
+      <w:r>
+        <w:rPr>
+          <w:rFonts w:ascii="Arial" w:hAnsi="Arial"/>
+          <w:color w:val="333333"/>
+          <w:sz w:val="21"/>
+        </w:rPr>
+        <w:t>Click the Users ▶ button to view user management options.</w:t>
+      </w:r>
+    </w:p>
+    <w:p>
+      <w:pPr>
+        <w:pStyle w:val="ListBullet"/>
+        <w:spacing w:after="40"/>
+      </w:pPr>
+      <w:r>
+        <w:rPr>
+          <w:rFonts w:ascii="Arial" w:hAnsi="Arial"/>
+          <w:color w:val="333333"/>
+          <w:sz w:val="21"/>
+        </w:rPr>
+        <w:t>Click the Federations ▶ button to view federation information.</w:t>
+      </w:r>
+    </w:p>
+    <w:p>
+      <w:pPr>
+        <w:pStyle w:val="ListBullet"/>
+        <w:spacing w:after="40"/>
+      </w:pPr>
+      <w:r>
+        <w:rPr>
+          <w:rFonts w:ascii="Arial" w:hAnsi="Arial"/>
+          <w:color w:val="333333"/>
+          <w:sz w:val="21"/>
+        </w:rPr>
+        <w:t>Click the GIS Maps ▶ button to open geographic information system maps.</w:t>
+      </w:r>
+    </w:p>
+    <w:p>
+      <w:pPr>
+        <w:pStyle w:val="ListBullet"/>
+        <w:spacing w:after="40"/>
+      </w:pPr>
+      <w:r>
+        <w:rPr>
+          <w:rFonts w:ascii="Arial" w:hAnsi="Arial"/>
+          <w:color w:val="333333"/>
+          <w:sz w:val="21"/>
+        </w:rPr>
+        <w:t>Click the Analytical Reports ▶ button to access analytical reporting tools.</w:t>
+      </w:r>
+    </w:p>
+    <w:p>
+      <w:pPr>
+        <w:pStyle w:val="ListBullet"/>
+        <w:spacing w:after="40"/>
+      </w:pPr>
+      <w:r>
+        <w:rPr>
+          <w:rFonts w:ascii="Arial" w:hAnsi="Arial"/>
+          <w:color w:val="333333"/>
+          <w:sz w:val="21"/>
+        </w:rPr>
+        <w:t>Click the All India Summary Report ▶ button to generate a national summary report.</w:t>
+      </w:r>
+    </w:p>
+    <w:p>
+      <w:pPr>
+        <w:pStyle w:val="ListBullet"/>
+        <w:spacing w:after="40"/>
+      </w:pPr>
+      <w:r>
+        <w:rPr>
+          <w:rFonts w:ascii="Arial" w:hAnsi="Arial"/>
+          <w:color w:val="333333"/>
+          <w:sz w:val="21"/>
+        </w:rPr>
+        <w:t>Click the Ranking Dashboard ▶ button to view ranking metrics.</w:t>
+      </w:r>
+    </w:p>
+    <w:p>
+      <w:pPr>
+        <w:pStyle w:val="ListBullet"/>
+        <w:spacing w:after="40"/>
+      </w:pPr>
+      <w:r>
+        <w:rPr>
+          <w:rFonts w:ascii="Arial" w:hAnsi="Arial"/>
+          <w:color w:val="333333"/>
+          <w:sz w:val="21"/>
+        </w:rPr>
+        <w:t>Click the Query Builder ▶ button to create custom queries.</w:t>
+      </w:r>
+    </w:p>
+    <w:p>
+      <w:pPr>
+        <w:pStyle w:val="ListBullet"/>
+        <w:spacing w:after="40"/>
+      </w:pPr>
+      <w:r>
+        <w:rPr>
+          <w:rFonts w:ascii="Arial" w:hAnsi="Arial"/>
+          <w:color w:val="333333"/>
+          <w:sz w:val="21"/>
+        </w:rPr>
+        <w:t>Click the Cooperative Banks ▶ button to view cooperative bank details.</w:t>
+      </w:r>
+    </w:p>
+    <w:p>
+      <w:pPr>
+        <w:pStyle w:val="ListBullet"/>
+        <w:spacing w:after="40"/>
+      </w:pPr>
+      <w:r>
+        <w:rPr>
+          <w:rFonts w:ascii="Arial" w:hAnsi="Arial"/>
+          <w:color w:val="333333"/>
+          <w:sz w:val="21"/>
+        </w:rPr>
+        <w:t>Click the State/Sector Write Up ▶ button to view state and sector write‑ups.</w:t>
+      </w:r>
+    </w:p>
+    <w:p>
+      <w:pPr>
+        <w:pStyle w:val="ListBullet"/>
+        <w:spacing w:after="40"/>
+      </w:pPr>
+      <w:r>
+        <w:rPr>
+          <w:rFonts w:ascii="Arial" w:hAnsi="Arial"/>
+          <w:color w:val="333333"/>
+          <w:sz w:val="21"/>
+        </w:rPr>
+        <w:t>Click the Functional Status Verification ▶ button to verify functional status.</w:t>
+      </w:r>
+    </w:p>
+    <w:p>
+      <w:r>
+        <w:br w:type="page"/>
+      </w:r>
+    </w:p>
+    <w:p>
+      <w:pPr>
+        <w:pStyle w:val="Heading1"/>
+        <w:keepNext/>
+        <w:spacing w:before="360" w:after="160"/>
+      </w:pPr>
+      <w:r>
+        <w:rPr>
+          <w:rFonts w:ascii="Segoe UI" w:hAnsi="Segoe UI"/>
+          <w:b/>
+          <w:color w:val="1B365D"/>
+          <w:sz w:val="40"/>
+        </w:rPr>
+        <w:t>1.</w:t>
+        <w:tab/>
+        <w:t>login</w:t>
+      </w:r>
+    </w:p>
+    <w:p>
+      <w:pPr>
+        <w:spacing w:line="276" w:lineRule="auto" w:after="120"/>
+      </w:pPr>
+      <w:r>
+        <w:rPr>
+          <w:rFonts w:ascii="Arial" w:hAnsi="Arial"/>
+          <w:color w:val="333333"/>
+          <w:sz w:val="21"/>
+        </w:rPr>
+        <w:t>The Login module controls user access to the Enterprise Application, ensuring that only authorized personnel can view and manage cooperative data. It provides a secure entry point and directs users to the system’s main dashboard.</w:t>
+      </w:r>
+    </w:p>
+    <w:p>
+      <w:pPr>
+        <w:spacing w:before="120" w:after="80"/>
+      </w:pPr>
+      <w:r>
+        <w:rPr>
+          <w:rFonts w:ascii="Arial" w:hAnsi="Arial"/>
+          <w:b/>
+          <w:color w:val="D97706"/>
+          <w:sz w:val="21"/>
+        </w:rPr>
+        <w:t>The login module includes features for:</w:t>
+      </w:r>
+    </w:p>
+    <w:p>
+      <w:pPr>
+        <w:pStyle w:val="ListBullet"/>
+        <w:spacing w:after="40"/>
+      </w:pPr>
+      <w:r>
+        <w:rPr>
+          <w:rFonts w:ascii="Arial" w:hAnsi="Arial"/>
+          <w:color w:val="333333"/>
+          <w:sz w:val="21"/>
+        </w:rPr>
+        <w:t>NCD Home — view cooperative statistics and navigate to other sections of the National Cooperative Database.</w:t>
+      </w:r>
+    </w:p>
+    <w:p>
+      <w:pPr>
+        <w:pStyle w:val="ListBullet"/>
+        <w:spacing w:after="40"/>
+      </w:pPr>
+      <w:r>
+        <w:rPr>
+          <w:rFonts w:ascii="Arial" w:hAnsi="Arial"/>
+          <w:color w:val="333333"/>
+          <w:sz w:val="21"/>
+        </w:rPr>
+        <w:t>Login — enter credentials to securely access the system.</w:t>
+      </w:r>
+    </w:p>
+    <w:p>
+      <w:pPr>
+        <w:spacing w:after="240"/>
+      </w:pPr>
+    </w:p>
+    <w:p>
+      <w:pPr>
+        <w:pStyle w:val="Heading2"/>
+        <w:keepNext/>
+        <w:spacing w:before="360" w:after="160"/>
+      </w:pPr>
+      <w:r>
+        <w:rPr>
+          <w:rFonts w:ascii="Segoe UI" w:hAnsi="Segoe UI"/>
+          <w:b/>
+          <w:color w:val="D97706"/>
+          <w:sz w:val="32"/>
+        </w:rPr>
+        <w:t>1.1</w:t>
+        <w:tab/>
+        <w:t>NCD Home</w:t>
+      </w:r>
+    </w:p>
+    <w:p>
+      <w:pPr>
+        <w:spacing w:line="276" w:lineRule="auto" w:after="120"/>
+      </w:pPr>
+      <w:r>
+        <w:rPr>
+          <w:rFonts w:ascii="Arial" w:hAnsi="Arial"/>
+          <w:color w:val="333333"/>
+          <w:sz w:val="21"/>
+        </w:rPr>
+        <w:t>The NCD Home screen provides an overview of cooperative statistics and access to various sections of the National Cooperative Database.</w:t>
+      </w:r>
+    </w:p>
+    <w:p>
+      <w:pPr>
+        <w:spacing w:line="276" w:lineRule="auto" w:after="120"/>
+      </w:pPr>
+      <w:r>
+        <w:rPr>
+          <w:rFonts w:ascii="Arial" w:hAnsi="Arial"/>
+          <w:color w:val="333333"/>
+          <w:sz w:val="21"/>
+        </w:rPr>
+        <w:t>Navigate to NCD Home from the main menu.</w:t>
+      </w:r>
+    </w:p>
+    <w:p>
+      <w:pPr>
+        <w:spacing w:before="80" w:after="80"/>
+        <w:jc w:val="center"/>
+      </w:pPr>
+      <w:r>
+        <w:drawing>
+          <wp:inline xmlns:a="http://schemas.openxmlformats.org/drawingml/2006/main" xmlns:pic="http://schemas.openxmlformats.org/drawingml/2006/picture">
+            <wp:extent cx="5759999" cy="2018999"/>
+            <wp:docPr id="4" name="Picture 4"/>
+            <wp:cNvGraphicFramePr>
+              <a:graphicFrameLocks noChangeAspect="1"/>
+            </wp:cNvGraphicFramePr>
+            <a:graphic>
+              <a:graphicData uri="http://schemas.openxmlformats.org/drawingml/2006/picture">
+                <pic:pic>
+                  <pic:nvPicPr>
+                    <pic:cNvPr id="0" name="screen_1_annotated.png"/>
+                    <pic:cNvPicPr/>
+                  </pic:nvPicPr>
+                  <pic:blipFill>
+                    <a:blip r:embed="rId14"/>
+                    <a:stretch>
+                      <a:fillRect/>
+                    </a:stretch>
+                  </pic:blipFill>
+                  <pic:spPr>
+                    <a:xfrm>
+                      <a:off x="0" y="0"/>
+                      <a:ext cx="5759999" cy="2018999"/>
+                    </a:xfrm>
+                    <a:prstGeom prst="rect"/>
+                  </pic:spPr>
+                </pic:pic>
+              </a:graphicData>
+            </a:graphic>
+          </wp:inline>
+        </w:drawing>
+      </w:r>
+    </w:p>
+    <w:p>
+      <w:pPr>
+        <w:pStyle w:val="Caption"/>
+        <w:spacing w:before="80" w:after="280"/>
+        <w:jc w:val="center"/>
+      </w:pPr>
+      <w:r>
+        <w:rPr>
+          <w:b/>
+          <w:i w:val="0"/>
+          <w:color w:val="D97706"/>
+          <w:sz w:val="20"/>
+        </w:rPr>
+        <w:t xml:space="preserve">Figure </w:t>
+      </w:r>
+      <w:r>
+        <w:rPr>
+          <w:b/>
+          <w:i w:val="0"/>
+          <w:color w:val="D97706"/>
+          <w:sz w:val="20"/>
+        </w:rPr>
+        <w:t>1-</w:t>
+      </w:r>
+      <w:r>
+        <w:rPr>
+          <w:sz w:val="20"/>
+          <w:szCs w:val="20"/>
+          <w:color w:val="D97706"/>
+        </w:rPr>
+        <w:fldChar w:fldCharType="begin"/>
+      </w:r>
+      <w:r>
+        <w:rPr>
+          <w:sz w:val="20"/>
+          <w:szCs w:val="20"/>
+          <w:color w:val="D97706"/>
+        </w:rPr>
+        <w:instrText xml:space="preserve"> SEQ Figure \* ARABIC</w:instrText>
+      </w:r>
+      <w:r>
+        <w:rPr>
+          <w:sz w:val="20"/>
+          <w:szCs w:val="20"/>
+          <w:color w:val="D97706"/>
+        </w:rPr>
+        <w:fldChar w:fldCharType="separate"/>
+      </w:r>
+      <w:r>
+        <w:rPr>
+          <w:sz w:val="20"/>
+          <w:szCs w:val="20"/>
+          <w:color w:val="D97706"/>
+        </w:rPr>
+        <w:t>1</w:t>
+      </w:r>
+      <w:r>
+        <w:rPr>
+          <w:sz w:val="20"/>
+          <w:szCs w:val="20"/>
+          <w:color w:val="D97706"/>
+        </w:rPr>
+        <w:fldChar w:fldCharType="end"/>
+      </w:r>
+      <w:r>
+        <w:rPr>
+          <w:b w:val="0"/>
+          <w:i/>
+          <w:color w:val="828282"/>
+          <w:sz w:val="20"/>
+        </w:rPr>
+        <w:t xml:space="preserve"> NCD Home</w:t>
+      </w:r>
+    </w:p>
+    <w:p>
+      <w:pPr>
+        <w:spacing w:before="80" w:after="80"/>
+        <w:jc w:val="center"/>
+      </w:pPr>
+      <w:r>
+        <w:drawing>
+          <wp:inline xmlns:a="http://schemas.openxmlformats.org/drawingml/2006/main" xmlns:pic="http://schemas.openxmlformats.org/drawingml/2006/picture">
+            <wp:extent cx="5759999" cy="2018999"/>
+            <wp:docPr id="5" name="Picture 5"/>
+            <wp:cNvGraphicFramePr>
+              <a:graphicFrameLocks noChangeAspect="1"/>
+            </wp:cNvGraphicFramePr>
+            <a:graphic>
+              <a:graphicData uri="http://schemas.openxmlformats.org/drawingml/2006/picture">
+                <pic:pic>
+                  <pic:nvPicPr>
+                    <pic:cNvPr id="0" name="screen_1_annotated.png"/>
+                    <pic:cNvPicPr/>
+                  </pic:nvPicPr>
+                  <pic:blipFill>
+                    <a:blip r:embed="rId14"/>
+                    <a:stretch>
+                      <a:fillRect/>
+                    </a:stretch>
+                  </pic:blipFill>
+                  <pic:spPr>
+                    <a:xfrm>
+                      <a:off x="0" y="0"/>
+                      <a:ext cx="5759999" cy="2018999"/>
+                    </a:xfrm>
+                    <a:prstGeom prst="rect"/>
+                  </pic:spPr>
+                </pic:pic>
+              </a:graphicData>
+            </a:graphic>
+          </wp:inline>
+        </w:drawing>
+      </w:r>
+    </w:p>
+    <w:p>
+      <w:pPr>
+        <w:pStyle w:val="Caption"/>
+        <w:spacing w:before="80" w:after="280"/>
+        <w:jc w:val="center"/>
+      </w:pPr>
+      <w:r>
+        <w:rPr>
+          <w:b/>
+          <w:i w:val="0"/>
+          <w:color w:val="D97706"/>
+          <w:sz w:val="20"/>
+        </w:rPr>
+        <w:t xml:space="preserve">Figure </w:t>
+      </w:r>
+      <w:r>
+        <w:rPr>
+          <w:b/>
+          <w:i w:val="0"/>
+          <w:color w:val="D97706"/>
+          <w:sz w:val="20"/>
+        </w:rPr>
+        <w:t>1-</w:t>
+      </w:r>
+      <w:r>
+        <w:rPr>
+          <w:sz w:val="20"/>
+          <w:szCs w:val="20"/>
+          <w:color w:val="D97706"/>
+        </w:rPr>
+        <w:fldChar w:fldCharType="begin"/>
+      </w:r>
+      <w:r>
+        <w:rPr>
+          <w:sz w:val="20"/>
+          <w:szCs w:val="20"/>
+          <w:color w:val="D97706"/>
+        </w:rPr>
+        <w:instrText xml:space="preserve"> SEQ Figure \* ARABIC</w:instrText>
+      </w:r>
+      <w:r>
+        <w:rPr>
+          <w:sz w:val="20"/>
+          <w:szCs w:val="20"/>
+          <w:color w:val="D97706"/>
+        </w:rPr>
+        <w:fldChar w:fldCharType="separate"/>
+      </w:r>
+      <w:r>
+        <w:rPr>
+          <w:sz w:val="20"/>
+          <w:szCs w:val="20"/>
+          <w:color w:val="D97706"/>
+        </w:rPr>
+        <w:t>1</w:t>
+      </w:r>
+      <w:r>
+        <w:rPr>
+          <w:sz w:val="20"/>
+          <w:szCs w:val="20"/>
+          <w:color w:val="D97706"/>
+        </w:rPr>
+        <w:fldChar w:fldCharType="end"/>
+      </w:r>
+      <w:r>
+        <w:rPr>
+          <w:b w:val="0"/>
+          <w:i/>
+          <w:color w:val="828282"/>
+          <w:sz w:val="20"/>
+        </w:rPr>
+        <w:t xml:space="preserve"> NCD Home ((continued))</w:t>
+      </w:r>
+    </w:p>
+    <w:p>
+      <w:pPr>
+        <w:spacing w:before="80" w:after="80"/>
+        <w:jc w:val="center"/>
+      </w:pPr>
+      <w:r>
+        <w:drawing>
+          <wp:inline xmlns:a="http://schemas.openxmlformats.org/drawingml/2006/main" xmlns:pic="http://schemas.openxmlformats.org/drawingml/2006/picture">
+            <wp:extent cx="5759999" cy="2018999"/>
+            <wp:docPr id="6" name="Picture 6"/>
+            <wp:cNvGraphicFramePr>
+              <a:graphicFrameLocks noChangeAspect="1"/>
+            </wp:cNvGraphicFramePr>
+            <a:graphic>
+              <a:graphicData uri="http://schemas.openxmlformats.org/drawingml/2006/picture">
+                <pic:pic>
+                  <pic:nvPicPr>
+                    <pic:cNvPr id="0" name="screen_1_annotated.png"/>
+                    <pic:cNvPicPr/>
+                  </pic:nvPicPr>
+                  <pic:blipFill>
+                    <a:blip r:embed="rId14"/>
+                    <a:stretch>
+                      <a:fillRect/>
+                    </a:stretch>
+                  </pic:blipFill>
+                  <pic:spPr>
+                    <a:xfrm>
+                      <a:off x="0" y="0"/>
+                      <a:ext cx="5759999" cy="2018999"/>
+                    </a:xfrm>
+                    <a:prstGeom prst="rect"/>
+                  </pic:spPr>
+                </pic:pic>
+              </a:graphicData>
+            </a:graphic>
+          </wp:inline>
+        </w:drawing>
+      </w:r>
+    </w:p>
+    <w:p>
+      <w:pPr>
+        <w:pStyle w:val="Caption"/>
+        <w:spacing w:before="80" w:after="280"/>
+        <w:jc w:val="center"/>
+      </w:pPr>
+      <w:r>
+        <w:rPr>
+          <w:b/>
+          <w:i w:val="0"/>
+          <w:color w:val="D97706"/>
+          <w:sz w:val="20"/>
+        </w:rPr>
+        <w:t xml:space="preserve">Figure </w:t>
+      </w:r>
+      <w:r>
+        <w:rPr>
+          <w:b/>
+          <w:i w:val="0"/>
+          <w:color w:val="D97706"/>
+          <w:sz w:val="20"/>
+        </w:rPr>
+        <w:t>1-</w:t>
+      </w:r>
+      <w:r>
+        <w:rPr>
+          <w:sz w:val="20"/>
+          <w:szCs w:val="20"/>
+          <w:color w:val="D97706"/>
+        </w:rPr>
+        <w:fldChar w:fldCharType="begin"/>
+      </w:r>
+      <w:r>
+        <w:rPr>
+          <w:sz w:val="20"/>
+          <w:szCs w:val="20"/>
+          <w:color w:val="D97706"/>
+        </w:rPr>
+        <w:instrText xml:space="preserve"> SEQ Figure \* ARABIC</w:instrText>
+      </w:r>
+      <w:r>
+        <w:rPr>
+          <w:sz w:val="20"/>
+          <w:szCs w:val="20"/>
+          <w:color w:val="D97706"/>
+        </w:rPr>
+        <w:fldChar w:fldCharType="separate"/>
+      </w:r>
+      <w:r>
+        <w:rPr>
+          <w:sz w:val="20"/>
+          <w:szCs w:val="20"/>
+          <w:color w:val="D97706"/>
+        </w:rPr>
+        <w:t>1</w:t>
+      </w:r>
+      <w:r>
+        <w:rPr>
+          <w:sz w:val="20"/>
+          <w:szCs w:val="20"/>
+          <w:color w:val="D97706"/>
+        </w:rPr>
+        <w:fldChar w:fldCharType="end"/>
+      </w:r>
+      <w:r>
+        <w:rPr>
+          <w:b w:val="0"/>
+          <w:i/>
+          <w:color w:val="828282"/>
+          <w:sz w:val="20"/>
+        </w:rPr>
+        <w:t xml:space="preserve"> NCD Home ((continued))</w:t>
+      </w:r>
+    </w:p>
+    <w:p>
+      <w:pPr>
+        <w:spacing w:before="80" w:after="80"/>
+        <w:jc w:val="center"/>
+      </w:pPr>
+      <w:r>
+        <w:drawing>
+          <wp:inline xmlns:a="http://schemas.openxmlformats.org/drawingml/2006/main" xmlns:pic="http://schemas.openxmlformats.org/drawingml/2006/picture">
+            <wp:extent cx="5759999" cy="2018999"/>
+            <wp:docPr id="7" name="Picture 7"/>
+            <wp:cNvGraphicFramePr>
+              <a:graphicFrameLocks noChangeAspect="1"/>
+            </wp:cNvGraphicFramePr>
+            <a:graphic>
+              <a:graphicData uri="http://schemas.openxmlformats.org/drawingml/2006/picture">
+                <pic:pic>
+                  <pic:nvPicPr>
+                    <pic:cNvPr id="0" name="screen_1_annotated.png"/>
+                    <pic:cNvPicPr/>
+                  </pic:nvPicPr>
+                  <pic:blipFill>
+                    <a:blip r:embed="rId14"/>
+                    <a:stretch>
+                      <a:fillRect/>
+                    </a:stretch>
+                  </pic:blipFill>
+                  <pic:spPr>
+                    <a:xfrm>
+                      <a:off x="0" y="0"/>
+                      <a:ext cx="5759999" cy="2018999"/>
+                    </a:xfrm>
+                    <a:prstGeom prst="rect"/>
+                  </pic:spPr>
+                </pic:pic>
+              </a:graphicData>
+            </a:graphic>
+          </wp:inline>
+        </w:drawing>
+      </w:r>
+    </w:p>
+    <w:p>
+      <w:pPr>
+        <w:pStyle w:val="Caption"/>
+        <w:spacing w:before="80" w:after="280"/>
+        <w:jc w:val="center"/>
+      </w:pPr>
+      <w:r>
+        <w:rPr>
+          <w:b/>
+          <w:i w:val="0"/>
+          <w:color w:val="D97706"/>
+          <w:sz w:val="20"/>
+        </w:rPr>
+        <w:t xml:space="preserve">Figure </w:t>
+      </w:r>
+      <w:r>
+        <w:rPr>
+          <w:b/>
+          <w:i w:val="0"/>
+          <w:color w:val="D97706"/>
+          <w:sz w:val="20"/>
+        </w:rPr>
+        <w:t>1-</w:t>
+      </w:r>
+      <w:r>
+        <w:rPr>
+          <w:sz w:val="20"/>
+          <w:szCs w:val="20"/>
+          <w:color w:val="D97706"/>
+        </w:rPr>
+        <w:fldChar w:fldCharType="begin"/>
+      </w:r>
+      <w:r>
+        <w:rPr>
+          <w:sz w:val="20"/>
+          <w:szCs w:val="20"/>
+          <w:color w:val="D97706"/>
+        </w:rPr>
+        <w:instrText xml:space="preserve"> SEQ Figure \* ARABIC</w:instrText>
+      </w:r>
+      <w:r>
+        <w:rPr>
+          <w:sz w:val="20"/>
+          <w:szCs w:val="20"/>
+          <w:color w:val="D97706"/>
+        </w:rPr>
+        <w:fldChar w:fldCharType="separate"/>
+      </w:r>
+      <w:r>
+        <w:rPr>
+          <w:sz w:val="20"/>
+          <w:szCs w:val="20"/>
+          <w:color w:val="D97706"/>
+        </w:rPr>
+        <w:t>1</w:t>
+      </w:r>
+      <w:r>
+        <w:rPr>
+          <w:sz w:val="20"/>
+          <w:szCs w:val="20"/>
+          <w:color w:val="D97706"/>
+        </w:rPr>
+        <w:fldChar w:fldCharType="end"/>
+      </w:r>
+      <w:r>
+        <w:rPr>
+          <w:b w:val="0"/>
+          <w:i/>
+          <w:color w:val="828282"/>
+          <w:sz w:val="20"/>
+        </w:rPr>
+        <w:t xml:space="preserve"> NCD Home ((continued))</w:t>
+      </w:r>
+    </w:p>
+    <w:p>
+      <w:pPr>
+        <w:spacing w:before="80" w:after="80"/>
+        <w:jc w:val="center"/>
+      </w:pPr>
+      <w:r>
+        <w:drawing>
+          <wp:inline xmlns:a="http://schemas.openxmlformats.org/drawingml/2006/main" xmlns:pic="http://schemas.openxmlformats.org/drawingml/2006/picture">
+            <wp:extent cx="5759999" cy="2018999"/>
+            <wp:docPr id="8" name="Picture 8"/>
+            <wp:cNvGraphicFramePr>
+              <a:graphicFrameLocks noChangeAspect="1"/>
+            </wp:cNvGraphicFramePr>
+            <a:graphic>
+              <a:graphicData uri="http://schemas.openxmlformats.org/drawingml/2006/picture">
+                <pic:pic>
+                  <pic:nvPicPr>
+                    <pic:cNvPr id="0" name="screen_1_annotated.png"/>
+                    <pic:cNvPicPr/>
+                  </pic:nvPicPr>
+                  <pic:blipFill>
+                    <a:blip r:embed="rId14"/>
+                    <a:stretch>
+                      <a:fillRect/>
+                    </a:stretch>
+                  </pic:blipFill>
+                  <pic:spPr>
+                    <a:xfrm>
+                      <a:off x="0" y="0"/>
+                      <a:ext cx="5759999" cy="2018999"/>
+                    </a:xfrm>
+                    <a:prstGeom prst="rect"/>
+                  </pic:spPr>
+                </pic:pic>
+              </a:graphicData>
+            </a:graphic>
+          </wp:inline>
+        </w:drawing>
+      </w:r>
+    </w:p>
+    <w:p>
+      <w:pPr>
+        <w:pStyle w:val="Caption"/>
+        <w:spacing w:before="80" w:after="280"/>
+        <w:jc w:val="center"/>
+      </w:pPr>
+      <w:r>
+        <w:rPr>
+          <w:b/>
+          <w:i w:val="0"/>
+          <w:color w:val="D97706"/>
+          <w:sz w:val="20"/>
+        </w:rPr>
+        <w:t xml:space="preserve">Figure </w:t>
+      </w:r>
+      <w:r>
+        <w:rPr>
+          <w:b/>
+          <w:i w:val="0"/>
+          <w:color w:val="D97706"/>
+          <w:sz w:val="20"/>
+        </w:rPr>
+        <w:t>1-</w:t>
+      </w:r>
+      <w:r>
+        <w:rPr>
+          <w:sz w:val="20"/>
+          <w:szCs w:val="20"/>
+          <w:color w:val="D97706"/>
+        </w:rPr>
+        <w:fldChar w:fldCharType="begin"/>
+      </w:r>
+      <w:r>
+        <w:rPr>
+          <w:sz w:val="20"/>
+          <w:szCs w:val="20"/>
+          <w:color w:val="D97706"/>
+        </w:rPr>
+        <w:instrText xml:space="preserve"> SEQ Figure \* ARABIC</w:instrText>
+      </w:r>
+      <w:r>
+        <w:rPr>
+          <w:sz w:val="20"/>
+          <w:szCs w:val="20"/>
+          <w:color w:val="D97706"/>
+        </w:rPr>
+        <w:fldChar w:fldCharType="separate"/>
+      </w:r>
+      <w:r>
+        <w:rPr>
+          <w:sz w:val="20"/>
+          <w:szCs w:val="20"/>
+          <w:color w:val="D97706"/>
+        </w:rPr>
+        <w:t>1</w:t>
+      </w:r>
+      <w:r>
+        <w:rPr>
+          <w:sz w:val="20"/>
+          <w:szCs w:val="20"/>
+          <w:color w:val="D97706"/>
+        </w:rPr>
+        <w:fldChar w:fldCharType="end"/>
+      </w:r>
+      <w:r>
+        <w:rPr>
+          <w:b w:val="0"/>
+          <w:i/>
+          <w:color w:val="828282"/>
+          <w:sz w:val="20"/>
+        </w:rPr>
+        <w:t xml:space="preserve"> NCD Home ((continued))</w:t>
+      </w:r>
+    </w:p>
+    <w:p>
+      <w:pPr>
+        <w:spacing w:before="120" w:after="80"/>
+      </w:pPr>
+      <w:r>
+        <w:rPr>
+          <w:rFonts w:ascii="Arial" w:hAnsi="Arial"/>
+          <w:b/>
+          <w:color w:val="D97706"/>
+          <w:sz w:val="21"/>
+        </w:rPr>
+        <w:t>User Actions / Steps:</w:t>
+      </w:r>
+    </w:p>
+    <w:p>
+      <w:pPr>
+        <w:pStyle w:val="ListBullet"/>
+        <w:spacing w:after="40"/>
+      </w:pPr>
+      <w:r>
+        <w:rPr>
+          <w:rFonts w:ascii="Arial" w:hAnsi="Arial"/>
+          <w:color w:val="333333"/>
+          <w:sz w:val="21"/>
+        </w:rPr>
+        <w:t>Click the Close button to dismiss the panel.</w:t>
+      </w:r>
+    </w:p>
+    <w:p>
+      <w:pPr>
+        <w:pStyle w:val="ListBullet"/>
+        <w:spacing w:after="40"/>
+      </w:pPr>
+      <w:r>
+        <w:rPr>
+          <w:rFonts w:ascii="Arial" w:hAnsi="Arial"/>
+          <w:color w:val="333333"/>
+          <w:sz w:val="21"/>
+        </w:rPr>
+        <w:t>Click the OFFICIAL LOGIN link to open the login page.</w:t>
+      </w:r>
+    </w:p>
+    <w:p>
+      <w:pPr>
+        <w:pStyle w:val="ListBullet"/>
+        <w:spacing w:after="40"/>
+      </w:pPr>
+      <w:r>
+        <w:rPr>
+          <w:rFonts w:ascii="Arial" w:hAnsi="Arial"/>
+          <w:color w:val="333333"/>
+          <w:sz w:val="21"/>
+        </w:rPr>
+        <w:t>Click the OFFICIAL LOGIN link again.</w:t>
       </w:r>
     </w:p>
     <w:p>
@@ -1800,7 +2892,242 @@
           <w:color w:val="333333"/>
           <w:sz w:val="21"/>
         </w:rPr>
-        <w:t>The AI Mode button provides AI‑assisted search suggestions.</w:t>
+        <w:t>Accessibility buttons affect visual presentation; use them according to user needs.</w:t>
+      </w:r>
+    </w:p>
+    <w:p>
+      <w:pPr>
+        <w:spacing w:before="80" w:after="80"/>
+      </w:pPr>
+      <w:r>
+        <w:rPr>
+          <w:rFonts w:ascii="Arial" w:hAnsi="Arial"/>
+          <w:b/>
+          <w:color w:val="C00000"/>
+          <w:sz w:val="21"/>
+        </w:rPr>
+        <w:t xml:space="preserve">Note: </w:t>
+      </w:r>
+      <w:r>
+        <w:rPr>
+          <w:rFonts w:ascii="Arial" w:hAnsi="Arial"/>
+          <w:color w:val="333333"/>
+          <w:sz w:val="21"/>
+        </w:rPr>
+        <w:t>Search buttons operate on the selections made in the State/UT and Sector dropdowns.</w:t>
+      </w:r>
+    </w:p>
+    <w:p>
+      <w:r>
+        <w:br w:type="page"/>
+      </w:r>
+    </w:p>
+    <w:p>
+      <w:pPr>
+        <w:pStyle w:val="Heading2"/>
+        <w:keepNext/>
+        <w:spacing w:before="360" w:after="160"/>
+      </w:pPr>
+      <w:r>
+        <w:rPr>
+          <w:rFonts w:ascii="Segoe UI" w:hAnsi="Segoe UI"/>
+          <w:b/>
+          <w:color w:val="D97706"/>
+          <w:sz w:val="32"/>
+        </w:rPr>
+        <w:t>1.2</w:t>
+        <w:tab/>
+        <w:t>Login</w:t>
+      </w:r>
+    </w:p>
+    <w:p>
+      <w:pPr>
+        <w:spacing w:line="276" w:lineRule="auto" w:after="120"/>
+      </w:pPr>
+      <w:r>
+        <w:rPr>
+          <w:rFonts w:ascii="Arial" w:hAnsi="Arial"/>
+          <w:color w:val="333333"/>
+          <w:sz w:val="21"/>
+        </w:rPr>
+        <w:t>The Login screen enables users to access the system securely using their credentials.</w:t>
+      </w:r>
+    </w:p>
+    <w:p>
+      <w:pPr>
+        <w:spacing w:line="276" w:lineRule="auto" w:after="120"/>
+      </w:pPr>
+      <w:r>
+        <w:rPr>
+          <w:rFonts w:ascii="Arial" w:hAnsi="Arial"/>
+          <w:color w:val="333333"/>
+          <w:sz w:val="21"/>
+        </w:rPr>
+        <w:t>Navigate to Login from the main menu.</w:t>
+      </w:r>
+    </w:p>
+    <w:p>
+      <w:pPr>
+        <w:spacing w:before="80" w:after="80"/>
+        <w:jc w:val="center"/>
+      </w:pPr>
+      <w:r>
+        <w:drawing>
+          <wp:inline xmlns:a="http://schemas.openxmlformats.org/drawingml/2006/main" xmlns:pic="http://schemas.openxmlformats.org/drawingml/2006/picture">
+            <wp:extent cx="5759999" cy="2835000"/>
+            <wp:docPr id="9" name="Picture 9"/>
+            <wp:cNvGraphicFramePr>
+              <a:graphicFrameLocks noChangeAspect="1"/>
+            </wp:cNvGraphicFramePr>
+            <a:graphic>
+              <a:graphicData uri="http://schemas.openxmlformats.org/drawingml/2006/picture">
+                <pic:pic>
+                  <pic:nvPicPr>
+                    <pic:cNvPr id="0" name="screen_2_annotated.png"/>
+                    <pic:cNvPicPr/>
+                  </pic:nvPicPr>
+                  <pic:blipFill>
+                    <a:blip r:embed="rId15"/>
+                    <a:stretch>
+                      <a:fillRect/>
+                    </a:stretch>
+                  </pic:blipFill>
+                  <pic:spPr>
+                    <a:xfrm>
+                      <a:off x="0" y="0"/>
+                      <a:ext cx="5759999" cy="2835000"/>
+                    </a:xfrm>
+                    <a:prstGeom prst="rect"/>
+                  </pic:spPr>
+                </pic:pic>
+              </a:graphicData>
+            </a:graphic>
+          </wp:inline>
+        </w:drawing>
+      </w:r>
+    </w:p>
+    <w:p>
+      <w:pPr>
+        <w:pStyle w:val="Caption"/>
+        <w:spacing w:before="80" w:after="280"/>
+        <w:jc w:val="center"/>
+      </w:pPr>
+      <w:r>
+        <w:rPr>
+          <w:b/>
+          <w:i w:val="0"/>
+          <w:color w:val="D97706"/>
+          <w:sz w:val="20"/>
+        </w:rPr>
+        <w:t xml:space="preserve">Figure </w:t>
+      </w:r>
+      <w:r>
+        <w:rPr>
+          <w:b/>
+          <w:i w:val="0"/>
+          <w:color w:val="D97706"/>
+          <w:sz w:val="20"/>
+        </w:rPr>
+        <w:t>1-</w:t>
+      </w:r>
+      <w:r>
+        <w:rPr>
+          <w:sz w:val="20"/>
+          <w:szCs w:val="20"/>
+          <w:color w:val="D97706"/>
+        </w:rPr>
+        <w:fldChar w:fldCharType="begin"/>
+      </w:r>
+      <w:r>
+        <w:rPr>
+          <w:sz w:val="20"/>
+          <w:szCs w:val="20"/>
+          <w:color w:val="D97706"/>
+        </w:rPr>
+        <w:instrText xml:space="preserve"> SEQ Figure \* ARABIC</w:instrText>
+      </w:r>
+      <w:r>
+        <w:rPr>
+          <w:sz w:val="20"/>
+          <w:szCs w:val="20"/>
+          <w:color w:val="D97706"/>
+        </w:rPr>
+        <w:fldChar w:fldCharType="separate"/>
+      </w:r>
+      <w:r>
+        <w:rPr>
+          <w:sz w:val="20"/>
+          <w:szCs w:val="20"/>
+          <w:color w:val="D97706"/>
+        </w:rPr>
+        <w:t>1</w:t>
+      </w:r>
+      <w:r>
+        <w:rPr>
+          <w:sz w:val="20"/>
+          <w:szCs w:val="20"/>
+          <w:color w:val="D97706"/>
+        </w:rPr>
+        <w:fldChar w:fldCharType="end"/>
+      </w:r>
+      <w:r>
+        <w:rPr>
+          <w:b w:val="0"/>
+          <w:i/>
+          <w:color w:val="828282"/>
+          <w:sz w:val="20"/>
+        </w:rPr>
+        <w:t xml:space="preserve"> Login</w:t>
+      </w:r>
+    </w:p>
+    <w:p>
+      <w:pPr>
+        <w:spacing w:before="120" w:after="80"/>
+      </w:pPr>
+      <w:r>
+        <w:rPr>
+          <w:rFonts w:ascii="Arial" w:hAnsi="Arial"/>
+          <w:b/>
+          <w:color w:val="D97706"/>
+          <w:sz w:val="21"/>
+        </w:rPr>
+        <w:t>User Actions / Steps:</w:t>
+      </w:r>
+    </w:p>
+    <w:p>
+      <w:pPr>
+        <w:pStyle w:val="ListBullet"/>
+        <w:spacing w:after="40"/>
+      </w:pPr>
+      <w:r>
+        <w:rPr>
+          <w:rFonts w:ascii="Arial" w:hAnsi="Arial"/>
+          <w:color w:val="333333"/>
+          <w:sz w:val="21"/>
+        </w:rPr>
+        <w:t>Click on the Email ID / Mobile No./ Username field.</w:t>
+      </w:r>
+    </w:p>
+    <w:p>
+      <w:pPr>
+        <w:spacing w:before="80" w:after="80"/>
+      </w:pPr>
+      <w:r>
+        <w:rPr>
+          <w:rFonts w:ascii="Arial" w:hAnsi="Arial"/>
+          <w:b/>
+          <w:color w:val="C00000"/>
+          <w:sz w:val="21"/>
+        </w:rPr>
+        <w:t xml:space="preserve">Note: </w:t>
+      </w:r>
+      <w:r>
+        <w:rPr>
+          <w:rFonts w:ascii="Arial" w:hAnsi="Arial"/>
+          <w:color w:val="333333"/>
+          <w:sz w:val="21"/>
+        </w:rPr>
+        <w:t>Select the appropriate authentication method (OTP or Password) before entering credentials.</w:t>
       </w:r>
     </w:p>
     <w:p>

</xml_diff>

<commit_message>
exe build script, launcher manuals viewer, and dynamic naming setup
</commit_message>
<xml_diff>
--- a/Final_Manuals/Final_Client_Manual.docx
+++ b/Final_Manuals/Final_Client_Manual.docx
@@ -311,7 +311,7 @@
                 <w:color w:val="333333"/>
                 <w:sz w:val="18"/>
               </w:rPr>
-              <w:t>16-07-2026</w:t>
+              <w:t>17-07-2026</w:t>
             </w:r>
           </w:p>
         </w:tc>
@@ -552,809 +552,6 @@
           <w:color w:val="FF8000"/>
           <w:sz w:val="40"/>
         </w:rPr>
-        <w:t>1.</w:t>
-        <w:tab/>
-        <w:t>login</w:t>
-      </w:r>
-    </w:p>
-    <w:p>
-      <w:pPr>
-        <w:spacing w:line="276" w:lineRule="auto" w:after="120"/>
-      </w:pPr>
-      <w:r>
-        <w:rPr>
-          <w:rFonts w:ascii="Arial" w:hAnsi="Arial"/>
-          <w:color w:val="333333"/>
-          <w:sz w:val="21"/>
-        </w:rPr>
-        <w:t>The Login module provides the entry point for all users to access the Enterprise Application securely. By entering valid credentials, users gain access to the system’s features and data.</w:t>
-      </w:r>
-    </w:p>
-    <w:p>
-      <w:pPr>
-        <w:spacing w:before="120" w:after="80"/>
-      </w:pPr>
-      <w:r>
-        <w:rPr>
-          <w:rFonts w:ascii="Arial" w:hAnsi="Arial"/>
-          <w:b/>
-          <w:color w:val="FF8000"/>
-          <w:sz w:val="21"/>
-        </w:rPr>
-        <w:t>The login module includes features for:</w:t>
-      </w:r>
-    </w:p>
-    <w:p>
-      <w:pPr>
-        <w:pStyle w:val="ListBullet"/>
-        <w:spacing w:after="40"/>
-      </w:pPr>
-      <w:r>
-        <w:rPr>
-          <w:rFonts w:ascii="Arial" w:hAnsi="Arial"/>
-          <w:color w:val="333333"/>
-          <w:sz w:val="21"/>
-        </w:rPr>
-        <w:t>Login — allows users to sign in with their credentials</w:t>
-      </w:r>
-    </w:p>
-    <w:p>
-      <w:pPr>
-        <w:pStyle w:val="Heading2"/>
-        <w:keepNext/>
-        <w:spacing w:before="360" w:after="160"/>
-      </w:pPr>
-      <w:r>
-        <w:rPr>
-          <w:rFonts w:ascii="Segoe UI" w:hAnsi="Segoe UI"/>
-          <w:b/>
-          <w:color w:val="FF8000"/>
-          <w:sz w:val="32"/>
-        </w:rPr>
-        <w:t>1.1</w:t>
-        <w:tab/>
-        <w:t>Login</w:t>
-      </w:r>
-    </w:p>
-    <w:p>
-      <w:pPr>
-        <w:spacing w:line="276" w:lineRule="auto" w:after="120"/>
-      </w:pPr>
-      <w:r>
-        <w:rPr>
-          <w:rFonts w:ascii="Arial" w:hAnsi="Arial"/>
-          <w:color w:val="333333"/>
-          <w:sz w:val="21"/>
-        </w:rPr>
-        <w:t>The Login screen enables users to access the system securely using their credentials.</w:t>
-      </w:r>
-    </w:p>
-    <w:p>
-      <w:pPr>
-        <w:spacing w:line="276" w:lineRule="auto" w:after="120"/>
-      </w:pPr>
-      <w:r>
-        <w:rPr>
-          <w:rFonts w:ascii="Arial" w:hAnsi="Arial"/>
-          <w:color w:val="333333"/>
-          <w:sz w:val="21"/>
-        </w:rPr>
-        <w:t>Navigate to Login from the main menu.</w:t>
-      </w:r>
-    </w:p>
-    <w:tbl>
-      <w:tblPr>
-        <w:tblW w:type="auto" w:w="0"/>
-        <w:tblLayout w:type="fixed"/>
-        <w:tblLook w:firstColumn="1" w:firstRow="1" w:lastColumn="0" w:lastRow="0" w:noHBand="0" w:noVBand="1" w:val="04A0"/>
-        <w:tblBorders>
-          <w:top w:val="none"/>
-          <w:left w:val="none"/>
-          <w:bottom w:val="none"/>
-          <w:right w:val="none"/>
-          <w:insideH w:val="none"/>
-          <w:insideV w:val="none"/>
-        </w:tblBorders>
-      </w:tblPr>
-      <w:tblGrid>
-        <w:gridCol w:w="9000"/>
-      </w:tblGrid>
-      <w:tr>
-        <w:tc>
-          <w:tcPr>
-            <w:tcW w:type="dxa" w:w="9026"/>
-            <w:tcMar>
-              <w:top w:w="0" w:type="dxa"/>
-              <w:bottom w:w="0" w:type="dxa"/>
-              <w:left w:w="0" w:type="dxa"/>
-              <w:right w:w="0" w:type="dxa"/>
-            </w:tcMar>
-            <w:tcBorders>
-              <w:top w:val="single" w:sz="4" w:space="0" w:color="CCCCCC"/>
-              <w:left w:val="single" w:sz="4" w:space="0" w:color="CCCCCC"/>
-              <w:bottom w:val="single" w:sz="4" w:space="0" w:color="CCCCCC"/>
-              <w:right w:val="single" w:sz="4" w:space="0" w:color="CCCCCC"/>
-            </w:tcBorders>
-          </w:tcPr>
-          <w:p>
-            <w:pPr>
-              <w:keepNext/>
-              <w:spacing w:before="80" w:after="80"/>
-              <w:jc w:val="center"/>
-            </w:pPr>
-            <w:r>
-              <w:drawing>
-                <wp:inline xmlns:a="http://schemas.openxmlformats.org/drawingml/2006/main" xmlns:pic="http://schemas.openxmlformats.org/drawingml/2006/picture">
-                  <wp:extent cx="5669280" cy="2790348"/>
-                  <wp:docPr id="1" name="Picture 1"/>
-                  <wp:cNvGraphicFramePr>
-                    <a:graphicFrameLocks noChangeAspect="1"/>
-                  </wp:cNvGraphicFramePr>
-                  <a:graphic>
-                    <a:graphicData uri="http://schemas.openxmlformats.org/drawingml/2006/picture">
-                      <pic:pic>
-                        <pic:nvPicPr>
-                          <pic:cNvPr id="0" name="screen_1_annotated.png"/>
-                          <pic:cNvPicPr/>
-                        </pic:nvPicPr>
-                        <pic:blipFill>
-                          <a:blip r:embed="rId11"/>
-                          <a:stretch>
-                            <a:fillRect/>
-                          </a:stretch>
-                        </pic:blipFill>
-                        <pic:spPr>
-                          <a:xfrm>
-                            <a:off x="0" y="0"/>
-                            <a:ext cx="5669280" cy="2790348"/>
-                          </a:xfrm>
-                          <a:prstGeom prst="rect"/>
-                        </pic:spPr>
-                      </pic:pic>
-                    </a:graphicData>
-                  </a:graphic>
-                </wp:inline>
-              </w:drawing>
-            </w:r>
-          </w:p>
-        </w:tc>
-      </w:tr>
-    </w:tbl>
-    <w:p>
-      <w:pPr>
-        <w:pStyle w:val="Caption"/>
-        <w:spacing w:before="80" w:after="280"/>
-        <w:jc w:val="center"/>
-      </w:pPr>
-      <w:r>
-        <w:rPr>
-          <w:b/>
-          <w:i w:val="0"/>
-          <w:color w:val="FF8000"/>
-          <w:sz w:val="20"/>
-        </w:rPr>
-        <w:t xml:space="preserve">Figure </w:t>
-      </w:r>
-      <w:r>
-        <w:rPr>
-          <w:b/>
-          <w:i w:val="0"/>
-          <w:color w:val="FF8000"/>
-          <w:sz w:val="20"/>
-        </w:rPr>
-        <w:t>1-</w:t>
-      </w:r>
-      <w:r>
-        <w:rPr>
-          <w:sz w:val="20"/>
-          <w:szCs w:val="20"/>
-          <w:color w:val="FF8000"/>
-        </w:rPr>
-        <w:fldChar w:fldCharType="begin"/>
-      </w:r>
-      <w:r>
-        <w:rPr>
-          <w:sz w:val="20"/>
-          <w:szCs w:val="20"/>
-          <w:color w:val="FF8000"/>
-        </w:rPr>
-        <w:instrText xml:space="preserve"> SEQ Figure \* ARABIC</w:instrText>
-      </w:r>
-      <w:r>
-        <w:rPr>
-          <w:sz w:val="20"/>
-          <w:szCs w:val="20"/>
-          <w:color w:val="FF8000"/>
-        </w:rPr>
-        <w:fldChar w:fldCharType="separate"/>
-      </w:r>
-      <w:r>
-        <w:rPr>
-          <w:sz w:val="20"/>
-          <w:szCs w:val="20"/>
-          <w:color w:val="FF8000"/>
-        </w:rPr>
-        <w:t>1</w:t>
-      </w:r>
-      <w:r>
-        <w:rPr>
-          <w:sz w:val="20"/>
-          <w:szCs w:val="20"/>
-          <w:color w:val="FF8000"/>
-        </w:rPr>
-        <w:fldChar w:fldCharType="end"/>
-      </w:r>
-      <w:r>
-        <w:rPr>
-          <w:b w:val="0"/>
-          <w:i/>
-          <w:color w:val="828282"/>
-          <w:sz w:val="20"/>
-        </w:rPr>
-        <w:t xml:space="preserve"> Login</w:t>
-      </w:r>
-    </w:p>
-    <w:p>
-      <w:pPr>
-        <w:spacing w:before="120" w:after="40"/>
-      </w:pPr>
-      <w:r>
-        <w:rPr>
-          <w:rFonts w:ascii="Arial" w:hAnsi="Arial"/>
-          <w:b/>
-          <w:color w:val="FF8000"/>
-          <w:sz w:val="21"/>
-        </w:rPr>
-        <w:t>Steps:</w:t>
-      </w:r>
-    </w:p>
-    <w:p>
-      <w:pPr>
-        <w:pStyle w:val="ListBullet"/>
-        <w:spacing w:after="40"/>
-      </w:pPr>
-      <w:r>
-        <w:rPr>
-          <w:rFonts w:ascii="Arial" w:hAnsi="Arial"/>
-          <w:b w:val="0"/>
-          <w:color w:val="333333"/>
-          <w:sz w:val="21"/>
-        </w:rPr>
-        <w:t>Enter the username in the Username field.</w:t>
-      </w:r>
-    </w:p>
-    <w:p>
-      <w:pPr>
-        <w:pStyle w:val="ListBullet"/>
-        <w:spacing w:after="40"/>
-      </w:pPr>
-      <w:r>
-        <w:rPr>
-          <w:rFonts w:ascii="Arial" w:hAnsi="Arial"/>
-          <w:b w:val="0"/>
-          <w:color w:val="333333"/>
-          <w:sz w:val="21"/>
-        </w:rPr>
-        <w:t>Enter the password in the Password field.</w:t>
-      </w:r>
-    </w:p>
-    <w:p>
-      <w:pPr>
-        <w:pStyle w:val="ListBullet"/>
-        <w:spacing w:after="40"/>
-      </w:pPr>
-      <w:r>
-        <w:rPr>
-          <w:rFonts w:ascii="Arial" w:hAnsi="Arial"/>
-          <w:b w:val="0"/>
-          <w:color w:val="333333"/>
-          <w:sz w:val="21"/>
-        </w:rPr>
-        <w:t>Click on the Login button to proceed.</w:t>
-      </w:r>
-    </w:p>
-    <w:p>
-      <w:pPr>
-        <w:spacing w:before="80" w:after="80"/>
-      </w:pPr>
-      <w:r>
-        <w:rPr>
-          <w:rFonts w:ascii="Arial" w:hAnsi="Arial"/>
-          <w:b/>
-          <w:color w:val="C00000"/>
-          <w:sz w:val="21"/>
-        </w:rPr>
-        <w:t xml:space="preserve">Note: </w:t>
-      </w:r>
-      <w:r>
-        <w:rPr>
-          <w:rFonts w:ascii="Arial" w:hAnsi="Arial"/>
-          <w:color w:val="333333"/>
-          <w:sz w:val="21"/>
-        </w:rPr>
-        <w:t>Ensure that the Caps Lock key is off when entering the password.</w:t>
-      </w:r>
-    </w:p>
-    <w:p>
-      <w:pPr>
-        <w:pStyle w:val="Heading1"/>
-        <w:keepNext/>
-        <w:spacing w:before="360" w:after="160"/>
-      </w:pPr>
-      <w:r>
-        <w:rPr>
-          <w:rFonts w:ascii="Segoe UI" w:hAnsi="Segoe UI"/>
-          <w:b/>
-          <w:color w:val="FF8000"/>
-          <w:sz w:val="40"/>
-        </w:rPr>
-        <w:t>2.</w:t>
-        <w:tab/>
-        <w:t>dashboard</w:t>
-      </w:r>
-    </w:p>
-    <w:p>
-      <w:pPr>
-        <w:spacing w:line="276" w:lineRule="auto" w:after="120"/>
-      </w:pPr>
-      <w:r>
-        <w:rPr>
-          <w:rFonts w:ascii="Arial" w:hAnsi="Arial"/>
-          <w:color w:val="333333"/>
-          <w:sz w:val="21"/>
-        </w:rPr>
-        <w:t>The Dashboard module gives users a consolidated view of the system’s most critical information at a glance. It surfaces real‑time metrics and highlights the status of all active records, enabling quick assessment of overall performance. This central hub streamlines monitoring and supports informed decision‑making across the enterprise.</w:t>
-      </w:r>
-    </w:p>
-    <w:p>
-      <w:pPr>
-        <w:spacing w:before="120" w:after="80"/>
-      </w:pPr>
-      <w:r>
-        <w:rPr>
-          <w:rFonts w:ascii="Arial" w:hAnsi="Arial"/>
-          <w:b/>
-          <w:color w:val="FF8000"/>
-          <w:sz w:val="21"/>
-        </w:rPr>
-        <w:t>The dashboard module includes features for:</w:t>
-      </w:r>
-    </w:p>
-    <w:p>
-      <w:pPr>
-        <w:pStyle w:val="ListBullet"/>
-        <w:spacing w:after="40"/>
-      </w:pPr>
-      <w:r>
-        <w:rPr>
-          <w:rFonts w:ascii="Arial" w:hAnsi="Arial"/>
-          <w:color w:val="333333"/>
-          <w:sz w:val="21"/>
-        </w:rPr>
-        <w:t>Dashboard — view an overview of all active records and key system metrics</w:t>
-      </w:r>
-    </w:p>
-    <w:p>
-      <w:pPr>
-        <w:pStyle w:val="Heading2"/>
-        <w:keepNext/>
-        <w:spacing w:before="360" w:after="160"/>
-      </w:pPr>
-      <w:r>
-        <w:rPr>
-          <w:rFonts w:ascii="Segoe UI" w:hAnsi="Segoe UI"/>
-          <w:b/>
-          <w:color w:val="FF8000"/>
-          <w:sz w:val="32"/>
-        </w:rPr>
-        <w:t>2.1</w:t>
-        <w:tab/>
-        <w:t>Dashboard</w:t>
-      </w:r>
-    </w:p>
-    <w:p>
-      <w:pPr>
-        <w:spacing w:line="276" w:lineRule="auto" w:after="120"/>
-      </w:pPr>
-      <w:r>
-        <w:rPr>
-          <w:rFonts w:ascii="Arial" w:hAnsi="Arial"/>
-          <w:color w:val="333333"/>
-          <w:sz w:val="21"/>
-        </w:rPr>
-        <w:t>The Dashboard screen provides an overview of all active records and key system metrics.</w:t>
-      </w:r>
-    </w:p>
-    <w:p>
-      <w:pPr>
-        <w:spacing w:line="276" w:lineRule="auto" w:after="120"/>
-      </w:pPr>
-      <w:r>
-        <w:rPr>
-          <w:rFonts w:ascii="Arial" w:hAnsi="Arial"/>
-          <w:color w:val="333333"/>
-          <w:sz w:val="21"/>
-        </w:rPr>
-        <w:t>Navigate to Dashboard from the main menu.</w:t>
-      </w:r>
-    </w:p>
-    <w:tbl>
-      <w:tblPr>
-        <w:tblW w:type="auto" w:w="0"/>
-        <w:tblLayout w:type="fixed"/>
-        <w:tblLook w:firstColumn="1" w:firstRow="1" w:lastColumn="0" w:lastRow="0" w:noHBand="0" w:noVBand="1" w:val="04A0"/>
-        <w:tblBorders>
-          <w:top w:val="none"/>
-          <w:left w:val="none"/>
-          <w:bottom w:val="none"/>
-          <w:right w:val="none"/>
-          <w:insideH w:val="none"/>
-          <w:insideV w:val="none"/>
-        </w:tblBorders>
-      </w:tblPr>
-      <w:tblGrid>
-        <w:gridCol w:w="9000"/>
-      </w:tblGrid>
-      <w:tr>
-        <w:tc>
-          <w:tcPr>
-            <w:tcW w:type="dxa" w:w="9026"/>
-            <w:tcMar>
-              <w:top w:w="0" w:type="dxa"/>
-              <w:bottom w:w="0" w:type="dxa"/>
-              <w:left w:w="0" w:type="dxa"/>
-              <w:right w:w="0" w:type="dxa"/>
-            </w:tcMar>
-            <w:tcBorders>
-              <w:top w:val="single" w:sz="4" w:space="0" w:color="CCCCCC"/>
-              <w:left w:val="single" w:sz="4" w:space="0" w:color="CCCCCC"/>
-              <w:bottom w:val="single" w:sz="4" w:space="0" w:color="CCCCCC"/>
-              <w:right w:val="single" w:sz="4" w:space="0" w:color="CCCCCC"/>
-            </w:tcBorders>
-          </w:tcPr>
-          <w:p>
-            <w:pPr>
-              <w:keepNext/>
-              <w:spacing w:before="80" w:after="80"/>
-              <w:jc w:val="center"/>
-            </w:pPr>
-            <w:r>
-              <w:drawing>
-                <wp:inline xmlns:a="http://schemas.openxmlformats.org/drawingml/2006/main" xmlns:pic="http://schemas.openxmlformats.org/drawingml/2006/picture">
-                  <wp:extent cx="5669280" cy="4173302"/>
-                  <wp:docPr id="2" name="Picture 2"/>
-                  <wp:cNvGraphicFramePr>
-                    <a:graphicFrameLocks noChangeAspect="1"/>
-                  </wp:cNvGraphicFramePr>
-                  <a:graphic>
-                    <a:graphicData uri="http://schemas.openxmlformats.org/drawingml/2006/picture">
-                      <pic:pic>
-                        <pic:nvPicPr>
-                          <pic:cNvPr id="0" name="screen_1_annotated.png"/>
-                          <pic:cNvPicPr/>
-                        </pic:nvPicPr>
-                        <pic:blipFill>
-                          <a:blip r:embed="rId12"/>
-                          <a:stretch>
-                            <a:fillRect/>
-                          </a:stretch>
-                        </pic:blipFill>
-                        <pic:spPr>
-                          <a:xfrm>
-                            <a:off x="0" y="0"/>
-                            <a:ext cx="5669280" cy="4173302"/>
-                          </a:xfrm>
-                          <a:prstGeom prst="rect"/>
-                        </pic:spPr>
-                      </pic:pic>
-                    </a:graphicData>
-                  </a:graphic>
-                </wp:inline>
-              </w:drawing>
-            </w:r>
-          </w:p>
-        </w:tc>
-      </w:tr>
-    </w:tbl>
-    <w:p>
-      <w:pPr>
-        <w:pStyle w:val="Caption"/>
-        <w:spacing w:before="80" w:after="280"/>
-        <w:jc w:val="center"/>
-      </w:pPr>
-      <w:r>
-        <w:rPr>
-          <w:b/>
-          <w:i w:val="0"/>
-          <w:color w:val="FF8000"/>
-          <w:sz w:val="20"/>
-        </w:rPr>
-        <w:t xml:space="preserve">Figure </w:t>
-      </w:r>
-      <w:r>
-        <w:rPr>
-          <w:b/>
-          <w:i w:val="0"/>
-          <w:color w:val="FF8000"/>
-          <w:sz w:val="20"/>
-        </w:rPr>
-        <w:t>2-</w:t>
-      </w:r>
-      <w:r>
-        <w:rPr>
-          <w:sz w:val="20"/>
-          <w:szCs w:val="20"/>
-          <w:color w:val="FF8000"/>
-        </w:rPr>
-        <w:fldChar w:fldCharType="begin"/>
-      </w:r>
-      <w:r>
-        <w:rPr>
-          <w:sz w:val="20"/>
-          <w:szCs w:val="20"/>
-          <w:color w:val="FF8000"/>
-        </w:rPr>
-        <w:instrText xml:space="preserve"> SEQ Figure \* ARABIC</w:instrText>
-      </w:r>
-      <w:r>
-        <w:rPr>
-          <w:sz w:val="20"/>
-          <w:szCs w:val="20"/>
-          <w:color w:val="FF8000"/>
-        </w:rPr>
-        <w:fldChar w:fldCharType="separate"/>
-      </w:r>
-      <w:r>
-        <w:rPr>
-          <w:sz w:val="20"/>
-          <w:szCs w:val="20"/>
-          <w:color w:val="FF8000"/>
-        </w:rPr>
-        <w:t>1</w:t>
-      </w:r>
-      <w:r>
-        <w:rPr>
-          <w:sz w:val="20"/>
-          <w:szCs w:val="20"/>
-          <w:color w:val="FF8000"/>
-        </w:rPr>
-        <w:fldChar w:fldCharType="end"/>
-      </w:r>
-      <w:r>
-        <w:rPr>
-          <w:b w:val="0"/>
-          <w:i/>
-          <w:color w:val="828282"/>
-          <w:sz w:val="20"/>
-        </w:rPr>
-        <w:t xml:space="preserve"> Dashboard</w:t>
-      </w:r>
-    </w:p>
-    <w:p>
-      <w:pPr>
-        <w:spacing w:before="120" w:after="40"/>
-      </w:pPr>
-      <w:r>
-        <w:rPr>
-          <w:rFonts w:ascii="Arial" w:hAnsi="Arial"/>
-          <w:b/>
-          <w:color w:val="FF8000"/>
-          <w:sz w:val="21"/>
-        </w:rPr>
-        <w:t>Steps:</w:t>
-      </w:r>
-    </w:p>
-    <w:p>
-      <w:pPr>
-        <w:pStyle w:val="ListBullet"/>
-        <w:spacing w:after="40"/>
-      </w:pPr>
-      <w:r>
-        <w:rPr>
-          <w:rFonts w:ascii="Arial" w:hAnsi="Arial"/>
-          <w:b w:val="0"/>
-          <w:color w:val="333333"/>
-          <w:sz w:val="21"/>
-        </w:rPr>
-        <w:t xml:space="preserve">Click the </w:t>
-      </w:r>
-      <w:r>
-        <w:rPr>
-          <w:rFonts w:ascii="Arial" w:hAnsi="Arial"/>
-          <w:b/>
-          <w:color w:val="333333"/>
-          <w:sz w:val="21"/>
-        </w:rPr>
-        <w:t>Upgrade button – opens the upgrade page.</w:t>
-      </w:r>
-      <w:r>
-        <w:rPr>
-          <w:rFonts w:ascii="Arial" w:hAnsi="Arial"/>
-          <w:b w:val="0"/>
-          <w:color w:val="333333"/>
-          <w:sz w:val="21"/>
-        </w:rPr>
-        <w:t xml:space="preserve"> button to perform the corresponding action.</w:t>
-      </w:r>
-    </w:p>
-    <w:p>
-      <w:pPr>
-        <w:pStyle w:val="ListBullet"/>
-        <w:spacing w:after="40"/>
-      </w:pPr>
-      <w:r>
-        <w:rPr>
-          <w:rFonts w:ascii="Arial" w:hAnsi="Arial"/>
-          <w:b w:val="0"/>
-          <w:color w:val="333333"/>
-          <w:sz w:val="21"/>
-        </w:rPr>
-        <w:t xml:space="preserve">Click the </w:t>
-      </w:r>
-      <w:r>
-        <w:rPr>
-          <w:rFonts w:ascii="Arial" w:hAnsi="Arial"/>
-          <w:b/>
-          <w:color w:val="333333"/>
-          <w:sz w:val="21"/>
-        </w:rPr>
-        <w:t>Help button – provides assistance and documentation.</w:t>
-      </w:r>
-      <w:r>
-        <w:rPr>
-          <w:rFonts w:ascii="Arial" w:hAnsi="Arial"/>
-          <w:b w:val="0"/>
-          <w:color w:val="333333"/>
-          <w:sz w:val="21"/>
-        </w:rPr>
-        <w:t xml:space="preserve"> button to perform the corresponding action.</w:t>
-      </w:r>
-    </w:p>
-    <w:p>
-      <w:pPr>
-        <w:pStyle w:val="ListBullet"/>
-        <w:spacing w:after="40"/>
-      </w:pPr>
-      <w:r>
-        <w:rPr>
-          <w:rFonts w:ascii="Arial" w:hAnsi="Arial"/>
-          <w:b w:val="0"/>
-          <w:color w:val="333333"/>
-          <w:sz w:val="21"/>
-        </w:rPr>
-        <w:t xml:space="preserve">Click the </w:t>
-      </w:r>
-      <w:r>
-        <w:rPr>
-          <w:rFonts w:ascii="Arial" w:hAnsi="Arial"/>
-          <w:b/>
-          <w:color w:val="333333"/>
-          <w:sz w:val="21"/>
-        </w:rPr>
-        <w:t>Assign Leave button – opens the Assign Leave form.</w:t>
-      </w:r>
-      <w:r>
-        <w:rPr>
-          <w:rFonts w:ascii="Arial" w:hAnsi="Arial"/>
-          <w:b w:val="0"/>
-          <w:color w:val="333333"/>
-          <w:sz w:val="21"/>
-        </w:rPr>
-        <w:t xml:space="preserve"> button to perform the corresponding action.</w:t>
-      </w:r>
-    </w:p>
-    <w:p>
-      <w:pPr>
-        <w:pStyle w:val="ListBullet"/>
-        <w:spacing w:after="40"/>
-      </w:pPr>
-      <w:r>
-        <w:rPr>
-          <w:rFonts w:ascii="Arial" w:hAnsi="Arial"/>
-          <w:b w:val="0"/>
-          <w:color w:val="333333"/>
-          <w:sz w:val="21"/>
-        </w:rPr>
-        <w:t xml:space="preserve">Click the </w:t>
-      </w:r>
-      <w:r>
-        <w:rPr>
-          <w:rFonts w:ascii="Arial" w:hAnsi="Arial"/>
-          <w:b/>
-          <w:color w:val="333333"/>
-          <w:sz w:val="21"/>
-        </w:rPr>
-        <w:t>Leave List button – displays the list of leave requests.</w:t>
-      </w:r>
-      <w:r>
-        <w:rPr>
-          <w:rFonts w:ascii="Arial" w:hAnsi="Arial"/>
-          <w:b w:val="0"/>
-          <w:color w:val="333333"/>
-          <w:sz w:val="21"/>
-        </w:rPr>
-        <w:t xml:space="preserve"> button to perform the corresponding action.</w:t>
-      </w:r>
-    </w:p>
-    <w:p>
-      <w:pPr>
-        <w:pStyle w:val="ListBullet"/>
-        <w:spacing w:after="40"/>
-      </w:pPr>
-      <w:r>
-        <w:rPr>
-          <w:rFonts w:ascii="Arial" w:hAnsi="Arial"/>
-          <w:b w:val="0"/>
-          <w:color w:val="333333"/>
-          <w:sz w:val="21"/>
-        </w:rPr>
-        <w:t xml:space="preserve">Click the </w:t>
-      </w:r>
-      <w:r>
-        <w:rPr>
-          <w:rFonts w:ascii="Arial" w:hAnsi="Arial"/>
-          <w:b/>
-          <w:color w:val="333333"/>
-          <w:sz w:val="21"/>
-        </w:rPr>
-        <w:t>Timesheets button – shows timesheet records.</w:t>
-      </w:r>
-      <w:r>
-        <w:rPr>
-          <w:rFonts w:ascii="Arial" w:hAnsi="Arial"/>
-          <w:b w:val="0"/>
-          <w:color w:val="333333"/>
-          <w:sz w:val="21"/>
-        </w:rPr>
-        <w:t xml:space="preserve"> button to perform the corresponding action.</w:t>
-      </w:r>
-    </w:p>
-    <w:p>
-      <w:pPr>
-        <w:pStyle w:val="ListBullet"/>
-        <w:spacing w:after="40"/>
-      </w:pPr>
-      <w:r>
-        <w:rPr>
-          <w:rFonts w:ascii="Arial" w:hAnsi="Arial"/>
-          <w:b w:val="0"/>
-          <w:color w:val="333333"/>
-          <w:sz w:val="21"/>
-        </w:rPr>
-        <w:t xml:space="preserve">Click the </w:t>
-      </w:r>
-      <w:r>
-        <w:rPr>
-          <w:rFonts w:ascii="Arial" w:hAnsi="Arial"/>
-          <w:b/>
-          <w:color w:val="333333"/>
-          <w:sz w:val="21"/>
-        </w:rPr>
-        <w:t>Apply Leave button – opens the Apply Leave form.</w:t>
-      </w:r>
-      <w:r>
-        <w:rPr>
-          <w:rFonts w:ascii="Arial" w:hAnsi="Arial"/>
-          <w:b w:val="0"/>
-          <w:color w:val="333333"/>
-          <w:sz w:val="21"/>
-        </w:rPr>
-        <w:t xml:space="preserve"> button to perform the corresponding action.</w:t>
-      </w:r>
-    </w:p>
-    <w:p>
-      <w:pPr>
-        <w:pStyle w:val="Heading1"/>
-        <w:keepNext/>
-        <w:spacing w:before="360" w:after="160"/>
-      </w:pPr>
-      <w:r>
-        <w:rPr>
-          <w:rFonts w:ascii="Segoe UI" w:hAnsi="Segoe UI"/>
-          <w:b/>
-          <w:color w:val="FF8000"/>
-          <w:sz w:val="40"/>
-        </w:rPr>
         <w:t>3.</w:t>
         <w:tab/>
         <w:t>apply leave</w:t>
@@ -1489,7 +686,7 @@
               <w:drawing>
                 <wp:inline xmlns:a="http://schemas.openxmlformats.org/drawingml/2006/main" xmlns:pic="http://schemas.openxmlformats.org/drawingml/2006/picture">
                   <wp:extent cx="5669280" cy="2790348"/>
-                  <wp:docPr id="3" name="Picture 3"/>
+                  <wp:docPr id="1" name="Picture 1"/>
                   <wp:cNvGraphicFramePr>
                     <a:graphicFrameLocks noChangeAspect="1"/>
                   </wp:cNvGraphicFramePr>
@@ -1501,7 +698,7 @@
                           <pic:cNvPicPr/>
                         </pic:nvPicPr>
                         <pic:blipFill>
-                          <a:blip r:embed="rId13"/>
+                          <a:blip r:embed="rId11"/>
                           <a:stretch>
                             <a:fillRect/>
                           </a:stretch>

</xml_diff>